<commit_message>
Add consultant sticky bar CTA to Modules Hub; sync Coaching Docs
Modules Hub: HubHome and ModuleHome now mount a fixed bottom bar
("Butuh arahan langsung? Booking panggilan gratis dengan konsultan.")
that opens the real Calendly diagnostic-call link in a new tab,
prefilled with the visitor's saved name/email when available. New
src/config/schedulingConfig.ts holds the Calendly URL (mirrors the
funnel app's own copy of this file). Deliberately not mounted inside
DeckViewer so it doesn't interrupt mid-chapter reading.

Also picks up the 3 modified Coaching Docs/*.docx files that were
sitting in the working tree.
</commit_message>
<xml_diff>
--- a/Coaching Docs/Coaching-Contract-SOW.docx
+++ b/Coaching Docs/Coaching-Contract-SOW.docx
@@ -15,7 +15,7 @@
           <w:sz w:val="36"/>
           <w:szCs w:val="36"/>
         </w:rPr>
-        <w:t xml:space="preserve">Perjanjian Kerja Sama Coaching Effortless System</w:t>
+        <w:t xml:space="preserve">Perjanjian Kerja Sama Coaching Effortless Leader</w:t>
       </w:r>
     </w:p>
     <w:p>
@@ -1095,7 +1095,7 @@
                 <w:sz w:val="19"/>
                 <w:szCs w:val="19"/>
               </w:rPr>
-              <w:t xml:space="preserve">Modul 1 — Audit Bisnis Sendiri</w:t>
+              <w:t xml:space="preserve">Effortless Leader — Program Leader</w:t>
             </w:r>
           </w:p>
         </w:tc>
@@ -1119,7 +1119,7 @@
                 <w:sz w:val="19"/>
                 <w:szCs w:val="19"/>
               </w:rPr>
-              <w:t xml:space="preserve">2 sesi</w:t>
+              <w:t xml:space="preserve">3 sesi</w:t>
             </w:r>
           </w:p>
         </w:tc>
@@ -1167,7 +1167,7 @@
                 <w:sz w:val="19"/>
                 <w:szCs w:val="19"/>
               </w:rPr>
-              <w:t xml:space="preserve">Rp3.000.000</w:t>
+              <w:t xml:space="preserve">Rp4.500.000</w:t>
             </w:r>
           </w:p>
         </w:tc>
@@ -1193,7 +1193,7 @@
                 <w:sz w:val="19"/>
                 <w:szCs w:val="19"/>
               </w:rPr>
-              <w:t xml:space="preserve">Modul 2 — Menyusun KPI</w:t>
+              <w:t xml:space="preserve">Modul 1 — Audit Bisnis Sendiri</w:t>
             </w:r>
           </w:p>
         </w:tc>
@@ -1217,7 +1217,7 @@
                 <w:sz w:val="19"/>
                 <w:szCs w:val="19"/>
               </w:rPr>
-              <w:t xml:space="preserve">3 sesi</w:t>
+              <w:t xml:space="preserve">2 sesi</w:t>
             </w:r>
           </w:p>
         </w:tc>
@@ -1265,7 +1265,7 @@
                 <w:sz w:val="19"/>
                 <w:szCs w:val="19"/>
               </w:rPr>
-              <w:t xml:space="preserve">Rp4.500.000</w:t>
+              <w:t xml:space="preserve">Rp3.000.000</w:t>
             </w:r>
           </w:p>
         </w:tc>
@@ -1291,7 +1291,7 @@
                 <w:sz w:val="19"/>
                 <w:szCs w:val="19"/>
               </w:rPr>
-              <w:t xml:space="preserve">Modul 3 — Memonitor Kesehatan Bisnis</w:t>
+              <w:t xml:space="preserve">Modul 2 — Menyusun KPI</w:t>
             </w:r>
           </w:p>
         </w:tc>
@@ -1389,7 +1389,7 @@
                 <w:sz w:val="19"/>
                 <w:szCs w:val="19"/>
               </w:rPr>
-              <w:t xml:space="preserve">Modul 4 — Merancang Proses Bisnis</w:t>
+              <w:t xml:space="preserve">Modul 3 — Memonitor Kesehatan Bisnis</w:t>
             </w:r>
           </w:p>
         </w:tc>
@@ -1413,7 +1413,7 @@
                 <w:sz w:val="19"/>
                 <w:szCs w:val="19"/>
               </w:rPr>
-              <w:t xml:space="preserve">4 sesi</w:t>
+              <w:t xml:space="preserve">3 sesi</w:t>
             </w:r>
           </w:p>
         </w:tc>
@@ -1461,7 +1461,7 @@
                 <w:sz w:val="19"/>
                 <w:szCs w:val="19"/>
               </w:rPr>
-              <w:t xml:space="preserve">Rp6.000.000</w:t>
+              <w:t xml:space="preserve">Rp4.500.000</w:t>
             </w:r>
           </w:p>
         </w:tc>
@@ -1487,7 +1487,7 @@
                 <w:sz w:val="19"/>
                 <w:szCs w:val="19"/>
               </w:rPr>
-              <w:t xml:space="preserve">Modul 5 — Membuat SOP yang Ditaati</w:t>
+              <w:t xml:space="preserve">Modul 4 — Merancang Proses Bisnis</w:t>
             </w:r>
           </w:p>
         </w:tc>
@@ -1511,7 +1511,7 @@
                 <w:sz w:val="19"/>
                 <w:szCs w:val="19"/>
               </w:rPr>
-              <w:t xml:space="preserve">3 sesi</w:t>
+              <w:t xml:space="preserve">4 sesi</w:t>
             </w:r>
           </w:p>
         </w:tc>
@@ -1559,7 +1559,7 @@
                 <w:sz w:val="19"/>
                 <w:szCs w:val="19"/>
               </w:rPr>
-              <w:t xml:space="preserve">Rp4.500.000</w:t>
+              <w:t xml:space="preserve">Rp6.000.000</w:t>
             </w:r>
           </w:p>
         </w:tc>
@@ -1585,7 +1585,7 @@
                 <w:sz w:val="19"/>
                 <w:szCs w:val="19"/>
               </w:rPr>
-              <w:t xml:space="preserve">Modul 6 — Manajemen Kinerja Tim</w:t>
+              <w:t xml:space="preserve">Modul 5 — Membuat SOP yang Ditaati</w:t>
             </w:r>
           </w:p>
         </w:tc>
@@ -1609,7 +1609,7 @@
                 <w:sz w:val="19"/>
                 <w:szCs w:val="19"/>
               </w:rPr>
-              <w:t xml:space="preserve">4 sesi</w:t>
+              <w:t xml:space="preserve">3 sesi</w:t>
             </w:r>
           </w:p>
         </w:tc>
@@ -1657,7 +1657,7 @@
                 <w:sz w:val="19"/>
                 <w:szCs w:val="19"/>
               </w:rPr>
-              <w:t xml:space="preserve">Rp6.000.000</w:t>
+              <w:t xml:space="preserve">Rp4.500.000</w:t>
             </w:r>
           </w:p>
         </w:tc>
@@ -1683,7 +1683,7 @@
                 <w:sz w:val="19"/>
                 <w:szCs w:val="19"/>
               </w:rPr>
-              <w:t xml:space="preserve">Modul 7 — Standar Kompetensi &amp; Rekrutmen</w:t>
+              <w:t xml:space="preserve">Modul 6 — Manajemen Kinerja Tim</w:t>
             </w:r>
           </w:p>
         </w:tc>
@@ -1707,7 +1707,7 @@
                 <w:sz w:val="19"/>
                 <w:szCs w:val="19"/>
               </w:rPr>
-              <w:t xml:space="preserve">3 sesi</w:t>
+              <w:t xml:space="preserve">4 sesi</w:t>
             </w:r>
           </w:p>
         </w:tc>
@@ -1755,7 +1755,7 @@
                 <w:sz w:val="19"/>
                 <w:szCs w:val="19"/>
               </w:rPr>
-              <w:t xml:space="preserve">Rp4.500.000</w:t>
+              <w:t xml:space="preserve">Rp6.000.000</w:t>
             </w:r>
           </w:p>
         </w:tc>
@@ -1781,7 +1781,7 @@
                 <w:sz w:val="19"/>
                 <w:szCs w:val="19"/>
               </w:rPr>
-              <w:t xml:space="preserve">Modul 8 — Mengelola Perubahan</w:t>
+              <w:t xml:space="preserve">Modul 7 — Standar Kompetensi &amp; Rekrutmen</w:t>
             </w:r>
           </w:p>
         </w:tc>
@@ -1879,6 +1879,104 @@
                 <w:sz w:val="19"/>
                 <w:szCs w:val="19"/>
               </w:rPr>
+              <w:t xml:space="preserve">Modul 8 — Mengelola Perubahan</w:t>
+            </w:r>
+          </w:p>
+        </w:tc>
+        <w:tc>
+          <w:tcPr>
+            <w:tcW w:type="dxa" w:w="3200"/>
+            <w:tcMar>
+              <w:top w:type="dxa" w:w="80"/>
+              <w:left w:type="dxa" w:w="100"/>
+              <w:bottom w:type="dxa" w:w="80"/>
+              <w:right w:type="dxa" w:w="100"/>
+            </w:tcMar>
+          </w:tcPr>
+          <w:p>
+            <w:pPr>
+              <w:jc w:val="center"/>
+            </w:pPr>
+            <w:r>
+              <w:rPr>
+                <w:color w:val="1F2937"/>
+                <w:sz w:val="19"/>
+                <w:szCs w:val="19"/>
+              </w:rPr>
+              <w:t xml:space="preserve">3 sesi</w:t>
+            </w:r>
+          </w:p>
+        </w:tc>
+        <w:tc>
+          <w:tcPr>
+            <w:tcW w:type="dxa" w:w="1200"/>
+            <w:tcMar>
+              <w:top w:type="dxa" w:w="80"/>
+              <w:left w:type="dxa" w:w="100"/>
+              <w:bottom w:type="dxa" w:w="80"/>
+              <w:right w:type="dxa" w:w="100"/>
+            </w:tcMar>
+          </w:tcPr>
+          <w:p>
+            <w:pPr>
+              <w:jc w:val="center"/>
+            </w:pPr>
+            <w:r>
+              <w:rPr>
+                <w:color w:val="1F2937"/>
+                <w:sz w:val="19"/>
+                <w:szCs w:val="19"/>
+              </w:rPr>
+              <w:t xml:space="preserve"/>
+            </w:r>
+          </w:p>
+        </w:tc>
+        <w:tc>
+          <w:tcPr>
+            <w:tcW w:type="dxa" w:w="2400"/>
+            <w:tcMar>
+              <w:top w:type="dxa" w:w="80"/>
+              <w:left w:type="dxa" w:w="100"/>
+              <w:bottom w:type="dxa" w:w="80"/>
+              <w:right w:type="dxa" w:w="100"/>
+            </w:tcMar>
+          </w:tcPr>
+          <w:p>
+            <w:pPr>
+              <w:jc w:val="center"/>
+            </w:pPr>
+            <w:r>
+              <w:rPr>
+                <w:color w:val="1F2937"/>
+                <w:sz w:val="19"/>
+                <w:szCs w:val="19"/>
+              </w:rPr>
+              <w:t xml:space="preserve">Rp4.500.000</w:t>
+            </w:r>
+          </w:p>
+        </w:tc>
+      </w:tr>
+      <w:tr>
+        <w:tc>
+          <w:tcPr>
+            <w:tcW w:type="dxa" w:w="2400"/>
+            <w:tcMar>
+              <w:top w:type="dxa" w:w="80"/>
+              <w:left w:type="dxa" w:w="100"/>
+              <w:bottom w:type="dxa" w:w="80"/>
+              <w:right w:type="dxa" w:w="100"/>
+            </w:tcMar>
+          </w:tcPr>
+          <w:p>
+            <w:pPr>
+              <w:jc w:val="left"/>
+            </w:pPr>
+            <w:r>
+              <w:rPr>
+                <w:color w:val="1F2937"/>
+                <w:sz w:val="19"/>
+                <w:szCs w:val="19"/>
+              </w:rPr>
               <w:t xml:space="preserve">Modul 9 — AI untuk Efisiensi Bisnis</w:t>
             </w:r>
           </w:p>
@@ -1952,6 +2050,104 @@
                 <w:szCs w:val="19"/>
               </w:rPr>
               <w:t xml:space="preserve">Rp3.000.000</w:t>
+            </w:r>
+          </w:p>
+        </w:tc>
+      </w:tr>
+      <w:tr>
+        <w:tc>
+          <w:tcPr>
+            <w:tcW w:type="dxa" w:w="2400"/>
+            <w:tcMar>
+              <w:top w:type="dxa" w:w="80"/>
+              <w:left w:type="dxa" w:w="100"/>
+              <w:bottom w:type="dxa" w:w="80"/>
+              <w:right w:type="dxa" w:w="100"/>
+            </w:tcMar>
+          </w:tcPr>
+          <w:p>
+            <w:pPr>
+              <w:jc w:val="left"/>
+            </w:pPr>
+            <w:r>
+              <w:rPr>
+                <w:color w:val="1F2937"/>
+                <w:sz w:val="19"/>
+                <w:szCs w:val="19"/>
+              </w:rPr>
+              <w:t xml:space="preserve">Effortless Team — Program Tim</w:t>
+            </w:r>
+          </w:p>
+        </w:tc>
+        <w:tc>
+          <w:tcPr>
+            <w:tcW w:type="dxa" w:w="3200"/>
+            <w:tcMar>
+              <w:top w:type="dxa" w:w="80"/>
+              <w:left w:type="dxa" w:w="100"/>
+              <w:bottom w:type="dxa" w:w="80"/>
+              <w:right w:type="dxa" w:w="100"/>
+            </w:tcMar>
+          </w:tcPr>
+          <w:p>
+            <w:pPr>
+              <w:jc w:val="center"/>
+            </w:pPr>
+            <w:r>
+              <w:rPr>
+                <w:color w:val="1F2937"/>
+                <w:sz w:val="19"/>
+                <w:szCs w:val="19"/>
+              </w:rPr>
+              <w:t xml:space="preserve">4 sesi</w:t>
+            </w:r>
+          </w:p>
+        </w:tc>
+        <w:tc>
+          <w:tcPr>
+            <w:tcW w:type="dxa" w:w="1200"/>
+            <w:tcMar>
+              <w:top w:type="dxa" w:w="80"/>
+              <w:left w:type="dxa" w:w="100"/>
+              <w:bottom w:type="dxa" w:w="80"/>
+              <w:right w:type="dxa" w:w="100"/>
+            </w:tcMar>
+          </w:tcPr>
+          <w:p>
+            <w:pPr>
+              <w:jc w:val="center"/>
+            </w:pPr>
+            <w:r>
+              <w:rPr>
+                <w:color w:val="1F2937"/>
+                <w:sz w:val="19"/>
+                <w:szCs w:val="19"/>
+              </w:rPr>
+              <w:t xml:space="preserve"/>
+            </w:r>
+          </w:p>
+        </w:tc>
+        <w:tc>
+          <w:tcPr>
+            <w:tcW w:type="dxa" w:w="2400"/>
+            <w:tcMar>
+              <w:top w:type="dxa" w:w="80"/>
+              <w:left w:type="dxa" w:w="100"/>
+              <w:bottom w:type="dxa" w:w="80"/>
+              <w:right w:type="dxa" w:w="100"/>
+            </w:tcMar>
+          </w:tcPr>
+          <w:p>
+            <w:pPr>
+              <w:jc w:val="center"/>
+            </w:pPr>
+            <w:r>
+              <w:rPr>
+                <w:color w:val="1F2937"/>
+                <w:sz w:val="19"/>
+                <w:szCs w:val="19"/>
+              </w:rPr>
+              <w:t xml:space="preserve">Rp6.000.000</w:t>
             </w:r>
           </w:p>
         </w:tc>

</xml_diff>